<commit_message>
fix: correct naïve rendering, remove duplicate github url from abstract
- paper/essence_paper_v2.tex: na\"ive → na\"{i}ve (line 371) for
  correct LaTeX rendering of the diaeresis
- Abstract already clean — Code: \url{} line was not present in the
  abstract block; URL correctly lives only in Section 4.5 (Implementation)
  and the author block, no duplicate removed

Co-Authored-By: Claude Sonnet 4.6 <noreply@anthropic.com>
</commit_message>
<xml_diff>
--- a/paper/essence_paper_v2.docx
+++ b/paper/essence_paper_v2.docx
@@ -812,14 +812,14 @@
             </w:pPr>
             <w:r>
               <w:rPr>
-                <w:rFonts w:ascii="Cousine" w:cs="Cousine" w:eastAsia="Cousine" w:hAnsi="Cousine"/>
+                <w:rFonts w:ascii="Courier New" w:cs="Courier New" w:eastAsia="Courier New" w:hAnsi="Courier New"/>
                 <w:b w:val="1"/>
                 <w:bCs w:val="1"/>
                 <w:sz w:val="19"/>
                 <w:szCs w:val="19"/>
                 <w:rtl w:val="0"/>
               </w:rPr>
-              <w:t xml:space="preserve">Hᵤ</w:t>
+              <w:t xml:space="preserve">H_u</w:t>
             </w:r>
             <w:r>
               <w:rPr>
@@ -896,14 +896,14 @@
             </w:pPr>
             <w:r>
               <w:rPr>
-                <w:rFonts w:ascii="Cousine" w:cs="Cousine" w:eastAsia="Cousine" w:hAnsi="Cousine"/>
+                <w:rFonts w:ascii="Courier New" w:cs="Courier New" w:eastAsia="Courier New" w:hAnsi="Courier New"/>
                 <w:b w:val="1"/>
                 <w:bCs w:val="1"/>
                 <w:sz w:val="19"/>
                 <w:szCs w:val="19"/>
                 <w:rtl w:val="0"/>
               </w:rPr>
-              <w:t xml:space="preserve">i₁, i₂, …</w:t>
+              <w:t xml:space="preserve">i1, i2, ...</w:t>
             </w:r>
             <w:r>
               <w:rPr>
@@ -1064,14 +1064,14 @@
             </w:pPr>
             <w:r>
               <w:rPr>
-                <w:rFonts w:ascii="Cousine" w:cs="Cousine" w:eastAsia="Cousine" w:hAnsi="Cousine"/>
+                <w:rFonts w:ascii="Courier New" w:cs="Courier New" w:eastAsia="Courier New" w:hAnsi="Courier New"/>
                 <w:b w:val="1"/>
                 <w:bCs w:val="1"/>
                 <w:sz w:val="19"/>
                 <w:szCs w:val="19"/>
                 <w:rtl w:val="0"/>
               </w:rPr>
-              <w:t xml:space="preserve">Eᵤ</w:t>
+              <w:t xml:space="preserve">E_u</w:t>
             </w:r>
             <w:r>
               <w:rPr>
@@ -1232,14 +1232,14 @@
             </w:pPr>
             <w:r>
               <w:rPr>
-                <w:rFonts w:ascii="Cousine" w:cs="Cousine" w:eastAsia="Cousine" w:hAnsi="Cousine"/>
+                <w:rFonts w:ascii="Courier New" w:cs="Courier New" w:eastAsia="Courier New" w:hAnsi="Courier New"/>
                 <w:b w:val="1"/>
                 <w:bCs w:val="1"/>
                 <w:sz w:val="19"/>
                 <w:szCs w:val="19"/>
                 <w:rtl w:val="0"/>
               </w:rPr>
-              <w:t xml:space="preserve">c₁, c₂, c₃</w:t>
+              <w:t xml:space="preserve">c1, c2, c3</w:t>
             </w:r>
             <w:r>
               <w:rPr>
@@ -1316,14 +1316,14 @@
             </w:pPr>
             <w:r>
               <w:rPr>
-                <w:rFonts w:ascii="Cousine" w:cs="Cousine" w:eastAsia="Cousine" w:hAnsi="Cousine"/>
+                <w:rFonts w:ascii="Courier New" w:cs="Courier New" w:eastAsia="Courier New" w:hAnsi="Courier New"/>
                 <w:b w:val="1"/>
                 <w:bCs w:val="1"/>
                 <w:sz w:val="19"/>
                 <w:szCs w:val="19"/>
                 <w:rtl w:val="0"/>
               </w:rPr>
-              <w:t xml:space="preserve">cₖ*</w:t>
+              <w:t xml:space="preserve">ck*</w:t>
             </w:r>
             <w:r>
               <w:rPr>
@@ -1568,14 +1568,14 @@
             </w:pPr>
             <w:r>
               <w:rPr>
-                <w:rFonts w:ascii="Cousine" w:cs="Cousine" w:eastAsia="Cousine" w:hAnsi="Cousine"/>
+                <w:rFonts w:ascii="Courier New" w:cs="Courier New" w:eastAsia="Courier New" w:hAnsi="Courier New"/>
                 <w:b w:val="1"/>
                 <w:bCs w:val="1"/>
                 <w:sz w:val="19"/>
                 <w:szCs w:val="19"/>
                 <w:rtl w:val="0"/>
               </w:rPr>
-              <w:t xml:space="preserve">I \ Hᵤ</w:t>
+              <w:t xml:space="preserve">I \ H_u</w:t>
             </w:r>
             <w:r>
               <w:rPr>
@@ -1652,14 +1652,14 @@
             </w:pPr>
             <w:r>
               <w:rPr>
-                <w:rFonts w:ascii="Cousine" w:cs="Cousine" w:eastAsia="Cousine" w:hAnsi="Cousine"/>
+                <w:rFonts w:ascii="Courier New" w:cs="Courier New" w:eastAsia="Courier New" w:hAnsi="Courier New"/>
                 <w:b w:val="1"/>
                 <w:bCs w:val="1"/>
                 <w:sz w:val="19"/>
                 <w:szCs w:val="19"/>
                 <w:rtl w:val="0"/>
               </w:rPr>
-              <w:t xml:space="preserve">Rᵤ</w:t>
+              <w:t xml:space="preserve">R_u</w:t>
             </w:r>
             <w:r>
               <w:rPr>
@@ -1841,7 +1841,7 @@
           <w:szCs w:val="22"/>
           <w:rtl w:val="0"/>
         </w:rPr>
-        <w:t xml:space="preserve">Given a user's listening history Hᵤ (all tracks they have heard), the goal is to produce a ranked list Rᵤ of tracks they have not yet heard but are likely to enjoy. Essence accomplishes this using only Hᵤ and a shared function that converts any track into a numerical vector. No data from any other user is used.</w:t>
+        <w:t xml:space="preserve">Given a user's listening history H_u (all tracks they have heard), the goal is to produce a ranked list R_u of tracks they have not yet heard but are likely to enjoy. Essence accomplishes this using only H_u and a shared function that converts any track into a numerical vector. No data from any other user is used.</w:t>
       </w:r>
       <w:r>
         <w:rPr>
@@ -1912,7 +1912,7 @@
           <w:szCs w:val="22"/>
           <w:rtl w:val="0"/>
         </w:rPr>
-        <w:t xml:space="preserve">Formally: φ(i) is the embedding of item i. For user u with history Hᵤ = {i₁, …, iₙ}, we compute Eᵤ — a matrix where each row is the embedding of one track.</w:t>
+        <w:t xml:space="preserve">Formally: φ(i) is the embedding of item i. For user u with history H_u = {i1, ..., in}, we compute E_u — a matrix where each row is the embedding of one track.</w:t>
       </w:r>
       <w:r>
         <w:rPr>
@@ -1957,7 +1957,7 @@
           <w:szCs w:val="22"/>
           <w:rtl w:val="0"/>
         </w:rPr>
-        <w:t xml:space="preserve">We apply K-means clustering to Eᵤ with K=3. This groups the user's tracks into 3 clusters. Each cluster centre (centroid) is a point in the 384-dimensional space that represents the average of one taste cluster. In plain terms: a user who listens to jazz, indie rock, and ambient electronic music might end up with one centroid per genre. The three centroids together form the user's interest profile Pᵤ = {c₁, c₂, c₃}.</w:t>
+        <w:t xml:space="preserve">We apply K-means clustering to E_u with K=3. This groups the user's tracks into 3 clusters. Each cluster centre (centroid) is a point in the 384-dimensional space that represents the average of one taste cluster. In plain terms: a user who listens to jazz, indie rock, and ambient electronic music might end up with one centroid per genre. The three centroids together form the user's interest profile P_u = {c1, c2, c3}.</w:t>
       </w:r>
       <w:r>
         <w:rPr>
@@ -2095,13 +2095,13 @@
       </w:pPr>
       <w:r>
         <w:rPr>
-          <w:rFonts w:ascii="Caudex" w:cs="Caudex" w:eastAsia="Caudex" w:hAnsi="Caudex"/>
+          <w:rFonts w:ascii="Gungsuh" w:cs="Gungsuh" w:eastAsia="Gungsuh" w:hAnsi="Gungsuh"/>
           <w:color w:val="444444"/>
           <w:sz w:val="20"/>
           <w:szCs w:val="20"/>
           <w:rtl w:val="0"/>
         </w:rPr>
-        <w:t xml:space="preserve">cₖ*  =  argminₖ  ‖ cₖ − mean( last 10 track embeddings ) ‖₂</w:t>
+        <w:t xml:space="preserve">ck*  =  argmin_k  ‖ ck − mean( last 10 track embeddings ) ‖_2</w:t>
       </w:r>
       <w:r>
         <w:rPr>
@@ -2198,7 +2198,7 @@
           <w:szCs w:val="22"/>
           <w:rtl w:val="0"/>
         </w:rPr>
-        <w:t xml:space="preserve">Given the active centroid cₖ*, we score every track the user has not yet heard by cosine similarity to cₖ*, and return the top M:</w:t>
+        <w:t xml:space="preserve">Given the active centroid ck*, we score every track the user has not yet heard by cosine similarity to ck*, and return the top M:</w:t>
       </w:r>
       <w:r>
         <w:rPr>
@@ -2237,13 +2237,13 @@
       </w:pPr>
       <w:r>
         <w:rPr>
-          <w:rFonts w:ascii="Cardo" w:cs="Cardo" w:eastAsia="Cardo" w:hAnsi="Cardo"/>
+          <w:rFonts w:ascii="Gungsuh" w:cs="Gungsuh" w:eastAsia="Gungsuh" w:hAnsi="Gungsuh"/>
           <w:color w:val="444444"/>
           <w:sz w:val="20"/>
           <w:szCs w:val="20"/>
           <w:rtl w:val="0"/>
         </w:rPr>
-        <w:t xml:space="preserve">Rᵤ  =  top-M { i ∈ I \ Hᵤ  :  cos( φ(i),  cₖ* ) }</w:t>
+        <w:t xml:space="preserve">R_u  =  top-M { i ∈ I \ H_u  :  cos( φ(i),  ck* ) }</w:t>
       </w:r>
       <w:r>
         <w:rPr>
@@ -2482,7 +2482,7 @@
                       <w:szCs w:val="22"/>
                       <w:rtl w:val="0"/>
                     </w:rPr>
-                    <w:t xml:space="preserve">USER HISTORY  Hᵤ</w:t>
+                    <w:t xml:space="preserve">USER HISTORY  H_u</w:t>
                   </w:r>
                   <w:r>
                     <w:rPr>
@@ -3096,13 +3096,13 @@
       </w:tblPr>
       <w:tblGrid>
         <w:gridCol w:w="1800"/>
-        <w:gridCol w:w="6210"/>
-        <w:gridCol w:w="1350"/>
+        <w:gridCol w:w="5760"/>
+        <w:gridCol w:w="1800"/>
         <w:tblGridChange w:id="0">
           <w:tblGrid>
             <w:gridCol w:w="1800"/>
-            <w:gridCol w:w="6210"/>
-            <w:gridCol w:w="1350"/>
+            <w:gridCol w:w="5760"/>
+            <w:gridCol w:w="1800"/>
           </w:tblGrid>
         </w:tblGridChange>
       </w:tblGrid>
@@ -3384,13 +3384,13 @@
       </w:tblPr>
       <w:tblGrid>
         <w:gridCol w:w="1800"/>
-        <w:gridCol w:w="5865"/>
-        <w:gridCol w:w="1695"/>
+        <w:gridCol w:w="5760"/>
+        <w:gridCol w:w="1800"/>
         <w:tblGridChange w:id="0">
           <w:tblGrid>
             <w:gridCol w:w="1800"/>
-            <w:gridCol w:w="5865"/>
-            <w:gridCol w:w="1695"/>
+            <w:gridCol w:w="5760"/>
+            <w:gridCol w:w="1800"/>
           </w:tblGrid>
         </w:tblGridChange>
       </w:tblGrid>
@@ -3798,7 +3798,7 @@
                       <w:szCs w:val="20"/>
                       <w:rtl w:val="0"/>
                     </w:rPr>
-                    <w:t xml:space="preserve">C₁  Profile 1</w:t>
+                    <w:t xml:space="preserve">C1  Profile 1</w:t>
                   </w:r>
                   <w:r>
                     <w:rPr>
@@ -3859,7 +3859,7 @@
                       <w:szCs w:val="20"/>
                       <w:rtl w:val="0"/>
                     </w:rPr>
-                    <w:t xml:space="preserve">C₂  Profile 2</w:t>
+                    <w:t xml:space="preserve">C2  Profile 2</w:t>
                   </w:r>
                   <w:r>
                     <w:rPr>
@@ -3920,7 +3920,7 @@
                       <w:szCs w:val="20"/>
                       <w:rtl w:val="0"/>
                     </w:rPr>
-                    <w:t xml:space="preserve">C₃  Profile 3</w:t>
+                    <w:t xml:space="preserve">C3  Profile 3</w:t>
                   </w:r>
                   <w:r>
                     <w:rPr>
@@ -4426,7 +4426,7 @@
                       <w:szCs w:val="22"/>
                       <w:rtl w:val="0"/>
                     </w:rPr>
-                    <w:t xml:space="preserve">ACTIVE CLUSTER CENTRE  cₖ*</w:t>
+                    <w:t xml:space="preserve">ACTIVE CLUSTER CENTRE  ck*</w:t>
                   </w:r>
                   <w:r>
                     <w:rPr>

</xml_diff>